<commit_message>
Actualizat documentul de testare
</commit_message>
<xml_diff>
--- a/Cerinte+Testare/Testare.docx
+++ b/Cerinte+Testare/Testare.docx
@@ -102,10 +102,7 @@
         <w:spacing w:after="20"/>
       </w:pPr>
       <w:r>
-        <w:t>Fiecare</w:t>
-      </w:r>
-      <w:r>
-        <w:t xml:space="preserve"> test cuprinde: scopul, comanda executată, mașina pe care se rulează, rezultatul așteptat și rezultatul obținut</w:t>
+        <w:t>Fiecare test cuprinde: scopul, comanda executată, mașina pe care se rulează, rezultatul așteptat și rezultatul obținut</w:t>
       </w:r>
     </w:p>
     <w:p>
@@ -128,10 +125,7 @@
       </w:r>
       <w:proofErr w:type="spellEnd"/>
       <w:r>
-        <w:t>), destinație 192.168.56.102 (user4). Utiliza</w:t>
-      </w:r>
-      <w:r>
-        <w:t xml:space="preserve">tor SSH: </w:t>
+        <w:t xml:space="preserve">), destinație 192.168.56.102 (user4). Utilizator SSH: </w:t>
       </w:r>
       <w:proofErr w:type="spellStart"/>
       <w:r>
@@ -172,10 +166,7 @@
         <w:spacing w:after="20"/>
       </w:pPr>
       <w:r>
-        <w:t xml:space="preserve">    </w:t>
-      </w:r>
-      <w:r>
-        <w:t xml:space="preserve">Aplicația rulează complet neinteractiv. Conexiunea între mașini se face prin chei SSH, iar operațiile privilegiate se execută cu </w:t>
+        <w:t xml:space="preserve">    Aplicația rulează complet neinteractiv. Conexiunea între mașini se face prin chei SSH, iar operațiile privilegiate se execută cu </w:t>
       </w:r>
       <w:proofErr w:type="spellStart"/>
       <w:r>
@@ -749,13 +740,7 @@
         <w:t>Scop:</w:t>
       </w:r>
       <w:r>
-        <w:t xml:space="preserve"> </w:t>
-      </w:r>
-      <w:r>
-        <w:t>V</w:t>
-      </w:r>
-      <w:r>
-        <w:t xml:space="preserve">erificarea faptului că aplicația respinge lansarea fără parametrul obligatoriu </w:t>
+        <w:t xml:space="preserve"> Verificarea faptului că aplicația respinge lansarea fără parametrul obligatoriu </w:t>
       </w:r>
       <w:r>
         <w:rPr>
@@ -924,13 +909,7 @@
         <w:t>Rezultat obținut:</w:t>
       </w:r>
       <w:r>
-        <w:t xml:space="preserve"> </w:t>
-      </w:r>
-      <w:r>
-        <w:t>A</w:t>
-      </w:r>
-      <w:r>
-        <w:t>plicația afișează eroarea „Parametrul --</w:t>
+        <w:t xml:space="preserve"> Aplicația afișează eroarea „Parametrul --</w:t>
       </w:r>
       <w:proofErr w:type="spellStart"/>
       <w:r>
@@ -960,6 +939,7 @@
       <w:r>
         <w:rPr>
           <w:rStyle w:val="Strong"/>
+          <w:noProof/>
         </w:rPr>
         <w:drawing>
           <wp:inline distT="0" distB="0" distL="0" distR="0" wp14:anchorId="5C850303" wp14:editId="3834254C">
@@ -1213,6 +1193,7 @@
       <w:r>
         <w:rPr>
           <w:rStyle w:val="Strong"/>
+          <w:noProof/>
         </w:rPr>
         <w:drawing>
           <wp:inline distT="0" distB="0" distL="0" distR="0" wp14:anchorId="19345084" wp14:editId="22B26A72">
@@ -1560,6 +1541,7 @@
       <w:r>
         <w:rPr>
           <w:rStyle w:val="Strong"/>
+          <w:noProof/>
         </w:rPr>
         <w:drawing>
           <wp:inline distT="0" distB="0" distL="0" distR="0" wp14:anchorId="64A67212" wp14:editId="5D5545CC">
@@ -1940,6 +1922,7 @@
       <w:r>
         <w:rPr>
           <w:rStyle w:val="Strong"/>
+          <w:noProof/>
         </w:rPr>
         <w:drawing>
           <wp:inline distT="0" distB="0" distL="0" distR="0" wp14:anchorId="254E8A1F" wp14:editId="70892C2A">
@@ -2329,6 +2312,7 @@
       <w:r>
         <w:rPr>
           <w:rStyle w:val="Strong"/>
+          <w:noProof/>
         </w:rPr>
         <w:drawing>
           <wp:inline distT="0" distB="0" distL="0" distR="0" wp14:anchorId="58189D2B" wp14:editId="43525403">
@@ -2664,6 +2648,7 @@
       <w:r>
         <w:rPr>
           <w:rStyle w:val="Strong"/>
+          <w:noProof/>
         </w:rPr>
         <w:lastRenderedPageBreak/>
         <w:drawing>
@@ -3012,6 +2997,7 @@
       <w:r>
         <w:rPr>
           <w:rStyle w:val="Strong"/>
+          <w:noProof/>
         </w:rPr>
         <w:drawing>
           <wp:inline distT="0" distB="0" distL="0" distR="0" wp14:anchorId="3B760F4A" wp14:editId="78A4DD11">
@@ -3354,12 +3340,14 @@
         <w:pStyle w:val="font-claude-response-body"/>
         <w:spacing w:before="0" w:beforeAutospacing="0" w:after="120" w:afterAutospacing="0"/>
         <w:rPr>
+          <w:b/>
+          <w:bCs/>
+        </w:rPr>
+      </w:pPr>
+      <w:r>
+        <w:rPr>
           <w:rStyle w:val="Strong"/>
-        </w:rPr>
-      </w:pPr>
-      <w:r>
-        <w:rPr>
-          <w:rStyle w:val="Strong"/>
+          <w:noProof/>
         </w:rPr>
         <w:drawing>
           <wp:inline distT="0" distB="0" distL="0" distR="0" wp14:anchorId="60A8E911" wp14:editId="4982D390">
@@ -3410,40 +3398,6 @@
       <w:r>
         <w:rPr>
           <w:rFonts w:ascii="Times New Roman" w:eastAsia="Times New Roman" w:hAnsi="Times New Roman" w:cs="Times New Roman"/>
-          <w:sz w:val="24"/>
-          <w:szCs w:val="24"/>
-        </w:rPr>
-        <w:t xml:space="preserve">A, în document. Iată textul complet pentru Test 10, în formatul tău (Scop / Pași / Rezultat îngroșate, </w:t>
-      </w:r>
-      <w:r>
-        <w:rPr>
-          <w:rFonts w:ascii="Courier New" w:eastAsia="Times New Roman" w:hAnsi="Courier New" w:cs="Courier New"/>
-          <w:sz w:val="20"/>
-          <w:szCs w:val="20"/>
-        </w:rPr>
-        <w:t>cd</w:t>
-      </w:r>
-      <w:r>
-        <w:rPr>
-          <w:rFonts w:ascii="Times New Roman" w:eastAsia="Times New Roman" w:hAnsi="Times New Roman" w:cs="Times New Roman"/>
-          <w:sz w:val="24"/>
-          <w:szCs w:val="24"/>
-        </w:rPr>
-        <w:t xml:space="preserve"> explicit):</w:t>
-      </w:r>
-    </w:p>
-    <w:p>
-      <w:pPr>
-        <w:spacing w:before="100" w:beforeAutospacing="1" w:after="100" w:afterAutospacing="1"/>
-        <w:rPr>
-          <w:rFonts w:ascii="Times New Roman" w:eastAsia="Times New Roman" w:hAnsi="Times New Roman" w:cs="Times New Roman"/>
-          <w:sz w:val="24"/>
-          <w:szCs w:val="24"/>
-        </w:rPr>
-      </w:pPr>
-      <w:r>
-        <w:rPr>
-          <w:rFonts w:ascii="Times New Roman" w:eastAsia="Times New Roman" w:hAnsi="Times New Roman" w:cs="Times New Roman"/>
           <w:b/>
           <w:bCs/>
           <w:sz w:val="24"/>
@@ -4159,6 +4113,9 @@
         </w:rPr>
       </w:pPr>
       <w:r>
+        <w:rPr>
+          <w:noProof/>
+        </w:rPr>
         <w:lastRenderedPageBreak/>
         <w:drawing>
           <wp:inline distT="0" distB="0" distL="0" distR="0" wp14:anchorId="6FD2893B" wp14:editId="7AE79BBC">
@@ -4567,6 +4524,7 @@
       <w:r>
         <w:rPr>
           <w:rFonts w:ascii="Times New Roman" w:eastAsia="Times New Roman" w:hAnsi="Times New Roman" w:cs="Times New Roman"/>
+          <w:noProof/>
           <w:sz w:val="24"/>
           <w:szCs w:val="24"/>
         </w:rPr>

</xml_diff>

<commit_message>
Reparat procesarea listelor cu mai multe elemente
</commit_message>
<xml_diff>
--- a/Cerinte+Testare/Testare.docx
+++ b/Cerinte+Testare/Testare.docx
@@ -44,7 +44,6 @@
       </w:pPr>
       <w:r>
         <w:rPr/>
-        <w:t>Proiect: Clonare sistem Linux</w:t>
       </w:r>
     </w:p>
     <w:p>
@@ -55,7 +54,6 @@
       </w:pPr>
       <w:r>
         <w:rPr/>
-        <w:t>Student: Vlădescu Rareș</w:t>
       </w:r>
     </w:p>
     <w:p>
@@ -65,28 +63,120 @@
         <w:rPr/>
       </w:pPr>
       <w:r>
-        <w:rPr/>
-        <w:t xml:space="preserve">Repository: </w:t>
-      </w:r>
-      <w:r>
+        <w:rPr>
+          <w:b/>
+          <w:bCs/>
+        </w:rPr>
+        <w:t>Proiect:</w:t>
+      </w:r>
+      <w:r>
+        <w:rPr/>
+        <w:t xml:space="preserve"> Clonare sistem Linux</w:t>
+      </w:r>
+    </w:p>
+    <w:p>
+      <w:pPr>
+        <w:pStyle w:val="Normal"/>
+        <w:spacing w:before="0" w:after="20"/>
+        <w:rPr/>
+      </w:pPr>
+      <w:r>
+        <w:rPr/>
+      </w:r>
+    </w:p>
+    <w:p>
+      <w:pPr>
+        <w:pStyle w:val="Normal"/>
+        <w:spacing w:before="0" w:after="20"/>
+        <w:rPr/>
+      </w:pPr>
+      <w:r>
+        <w:rPr>
+          <w:b/>
+          <w:bCs/>
+        </w:rPr>
+        <w:t xml:space="preserve">Student: </w:t>
+      </w:r>
+      <w:r>
+        <w:rPr/>
+        <w:t>Vlădescu Rareș</w:t>
+      </w:r>
+    </w:p>
+    <w:p>
+      <w:pPr>
+        <w:pStyle w:val="Normal"/>
+        <w:spacing w:before="0" w:after="20"/>
+        <w:rPr/>
+      </w:pPr>
+      <w:r>
+        <w:rPr/>
+      </w:r>
+    </w:p>
+    <w:p>
+      <w:pPr>
+        <w:pStyle w:val="Normal"/>
+        <w:spacing w:before="0" w:after="20"/>
+        <w:rPr/>
+      </w:pPr>
+      <w:r>
+        <w:rPr>
+          <w:b/>
+          <w:bCs/>
+        </w:rPr>
+        <w:t>Repository:</w:t>
+      </w:r>
+      <w:r>
+        <w:rPr/>
+        <w:t xml:space="preserve"> </w:t>
+      </w:r>
+      <w:hyperlink r:id="rId3">
+        <w:r>
+          <w:rPr>
+            <w:rStyle w:val="Hyperlink"/>
+            <w:color w:val="1F4E79"/>
+          </w:rPr>
+          <w:t>https://github.com/R-V12/Clonare-sistem-Linux</w:t>
+        </w:r>
+      </w:hyperlink>
+    </w:p>
+    <w:p>
+      <w:pPr>
+        <w:pStyle w:val="Normal"/>
+        <w:spacing w:before="0" w:after="20"/>
         <w:rPr>
           <w:color w:val="1F4E79"/>
         </w:rPr>
-        <w:t>https://github.com/R-V12/Clonare-sistem-Linux</w:t>
+      </w:pPr>
+      <w:r>
+        <w:rPr/>
       </w:r>
     </w:p>
     <w:p>
       <w:pPr>
         <w:pStyle w:val="Heading1"/>
         <w:spacing w:before="0" w:after="20"/>
-        <w:rPr/>
-      </w:pPr>
-      <w:r>
         <w:rPr>
           <w:b/>
           <w:bCs/>
           <w:color w:val="1F4E79"/>
         </w:rPr>
+      </w:pPr>
+      <w:r>
+        <w:rPr/>
+      </w:r>
+    </w:p>
+    <w:p>
+      <w:pPr>
+        <w:pStyle w:val="Heading1"/>
+        <w:spacing w:before="0" w:after="20"/>
+        <w:rPr/>
+      </w:pPr>
+      <w:r>
+        <w:rPr>
+          <w:b/>
+          <w:bCs/>
+          <w:color w:val="1F4E79"/>
+        </w:rPr>
         <w:t>1. Scopul și mediul de testare</w:t>
       </w:r>
     </w:p>
@@ -119,15 +209,35 @@
         <w:rPr/>
       </w:pPr>
       <w:r>
-        <w:rPr>
-          <w:b/>
-          <w:bCs/>
-        </w:rPr>
-        <w:t xml:space="preserve">Configurația de test: </w:t>
-      </w:r>
-      <w:r>
-        <w:rPr/>
-        <w:t>sursă 192.168.56.101 (user3 + pachetul cowsay), destinație 192.168.56.102 (user4). Utilizator SSH: vladescu.</w:t>
+        <w:rPr/>
+      </w:r>
+    </w:p>
+    <w:p>
+      <w:pPr>
+        <w:pStyle w:val="Normal"/>
+        <w:spacing w:before="0" w:after="20"/>
+        <w:rPr/>
+      </w:pPr>
+      <w:r>
+        <w:rPr>
+          <w:b/>
+          <w:bCs/>
+        </w:rPr>
+        <w:t>Configurația de test:</w:t>
+      </w:r>
+      <w:r>
+        <w:rPr/>
+        <w:t xml:space="preserve"> sursă 192.168.56.101 (utilizatorul user3 cu fișierul test.py în home-directory, pachetele cowsay și tree), destinație 192.168.56.102 (utilizatorul user4). Utilizator SSH: vladescu.</w:t>
+      </w:r>
+    </w:p>
+    <w:p>
+      <w:pPr>
+        <w:pStyle w:val="Normal"/>
+        <w:spacing w:before="0" w:after="20"/>
+        <w:rPr/>
+      </w:pPr>
+      <w:r>
+        <w:rPr/>
       </w:r>
     </w:p>
     <w:p>
@@ -418,7 +528,7 @@
                     </pic:cNvPicPr>
                   </pic:nvPicPr>
                   <pic:blipFill>
-                    <a:blip r:embed="rId2"/>
+                    <a:blip r:embed="rId4"/>
                     <a:stretch>
                       <a:fillRect/>
                     </a:stretch>
@@ -605,9 +715,7 @@
       <w:pPr>
         <w:pStyle w:val="font-claude-response-body"/>
         <w:spacing w:beforeAutospacing="0" w:before="0" w:afterAutospacing="0" w:after="120"/>
-        <w:rPr>
-          <w:rStyle w:val="Strong"/>
-        </w:rPr>
+        <w:rPr/>
       </w:pPr>
       <w:r>
         <w:rPr>
@@ -798,7 +906,7 @@
                     </pic:cNvPicPr>
                   </pic:nvPicPr>
                   <pic:blipFill>
-                    <a:blip r:embed="rId3"/>
+                    <a:blip r:embed="rId5"/>
                     <a:stretch>
                       <a:fillRect/>
                     </a:stretch>
@@ -1003,7 +1111,7 @@
                     </pic:cNvPicPr>
                   </pic:nvPicPr>
                   <pic:blipFill>
-                    <a:blip r:embed="rId4"/>
+                    <a:blip r:embed="rId6"/>
                     <a:stretch>
                       <a:fillRect/>
                     </a:stretch>
@@ -1280,7 +1388,7 @@
                     </pic:cNvPicPr>
                   </pic:nvPicPr>
                   <pic:blipFill>
-                    <a:blip r:embed="rId5"/>
+                    <a:blip r:embed="rId7"/>
                     <a:stretch>
                       <a:fillRect/>
                     </a:stretch>
@@ -1554,7 +1662,7 @@
                     </pic:cNvPicPr>
                   </pic:nvPicPr>
                   <pic:blipFill>
-                    <a:blip r:embed="rId6"/>
+                    <a:blip r:embed="rId8"/>
                     <a:stretch>
                       <a:fillRect/>
                     </a:stretch>
@@ -1613,7 +1721,7 @@
                     </pic:cNvPicPr>
                   </pic:nvPicPr>
                   <pic:blipFill>
-                    <a:blip r:embed="rId7"/>
+                    <a:blip r:embed="rId9"/>
                     <a:stretch>
                       <a:fillRect/>
                     </a:stretch>
@@ -1845,7 +1953,7 @@
                     </pic:cNvPicPr>
                   </pic:nvPicPr>
                   <pic:blipFill>
-                    <a:blip r:embed="rId8"/>
+                    <a:blip r:embed="rId10"/>
                     <a:stretch>
                       <a:fillRect/>
                     </a:stretch>
@@ -2096,7 +2204,7 @@
                     </pic:cNvPicPr>
                   </pic:nvPicPr>
                   <pic:blipFill>
-                    <a:blip r:embed="rId9"/>
+                    <a:blip r:embed="rId11"/>
                     <a:stretch>
                       <a:fillRect/>
                     </a:stretch>
@@ -2368,7 +2476,7 @@
                     </pic:cNvPicPr>
                   </pic:nvPicPr>
                   <pic:blipFill>
-                    <a:blip r:embed="rId10"/>
+                    <a:blip r:embed="rId12"/>
                     <a:stretch>
                       <a:fillRect/>
                     </a:stretch>
@@ -2624,7 +2732,7 @@
                     </pic:cNvPicPr>
                   </pic:nvPicPr>
                   <pic:blipFill>
-                    <a:blip r:embed="rId11"/>
+                    <a:blip r:embed="rId13"/>
                     <a:stretch>
                       <a:fillRect/>
                     </a:stretch>
@@ -2903,7 +3011,7 @@
                     </pic:cNvPicPr>
                   </pic:nvPicPr>
                   <pic:blipFill>
-                    <a:blip r:embed="rId12"/>
+                    <a:blip r:embed="rId14"/>
                     <a:stretch>
                       <a:fillRect/>
                     </a:stretch>
@@ -3135,7 +3243,7 @@
           <w:sz w:val="24"/>
           <w:szCs w:val="24"/>
         </w:rPr>
-        <w:t>), transferă home-directory-ul și instalează pachetul cowsay. Se afișează mesajul final „Clonare finalizata”.</w:t>
+        <w:t>), transferă home-directory-ul și instalează pachetele cowsay și tree.. Se afișează mesajul final „Clonare finalizata”.</w:t>
       </w:r>
     </w:p>
     <w:p>
@@ -3167,7 +3275,7 @@
                     </pic:cNvPicPr>
                   </pic:nvPicPr>
                   <pic:blipFill>
-                    <a:blip r:embed="rId13"/>
+                    <a:blip r:embed="rId15"/>
                     <a:stretch>
                       <a:fillRect/>
                     </a:stretch>
@@ -3569,7 +3677,7 @@
                     </pic:cNvPicPr>
                   </pic:nvPicPr>
                   <pic:blipFill>
-                    <a:blip r:embed="rId14"/>
+                    <a:blip r:embed="rId16"/>
                     <a:stretch>
                       <a:fillRect/>
                     </a:stretch>
@@ -3930,7 +4038,7 @@
                     </pic:cNvPicPr>
                   </pic:nvPicPr>
                   <pic:blipFill>
-                    <a:blip r:embed="rId15"/>
+                    <a:blip r:embed="rId17"/>
                     <a:stretch>
                       <a:fillRect/>
                     </a:stretch>
@@ -3981,8 +4089,15 @@
         <w:rPr/>
       </w:pPr>
       <w:r>
-        <w:rPr/>
-        <w:t>Scop: Verificarea faptului că un pachet prezent pe sursă și absent pe destinație este instalat pe destinație în urma clonării.</w:t>
+        <w:rPr>
+          <w:b/>
+          <w:bCs/>
+        </w:rPr>
+        <w:t xml:space="preserve">Scop: </w:t>
+      </w:r>
+      <w:r>
+        <w:rPr/>
+        <w:t>Verificarea faptului că un pachet prezent pe sursă și absent pe destinație este instalat pe destinație în urma clonării.</w:t>
         <w:br/>
         <w:t>Pași:</w:t>
       </w:r>
@@ -4088,8 +4203,15 @@
         <w:rPr/>
       </w:pPr>
       <w:r>
-        <w:rPr/>
-        <w:t xml:space="preserve">Rezultat obținut: Înainte de clonare, comanda </w:t>
+        <w:rPr>
+          <w:b/>
+          <w:bCs/>
+        </w:rPr>
+        <w:t>Rezultat obținut:</w:t>
+      </w:r>
+      <w:r>
+        <w:rPr/>
+        <w:t xml:space="preserve"> Înainte de clonare, comanda </w:t>
       </w:r>
       <w:r>
         <w:rPr>
@@ -4099,47 +4221,192 @@
       </w:r>
       <w:r>
         <w:rPr/>
-        <w:t xml:space="preserve"> nu returnează nimic pe destinație, pachetul fiind absent. Aplicația detectează pachetul </w:t>
+        <w:t xml:space="preserve"> nu returnează nimic pe destinație, pachetul fiind absent. Aplicația detectează pachetele cowsay și tree ca lipsind pe destinație și le instalează prin apt.</w:t>
+      </w:r>
+    </w:p>
+    <w:p>
+      <w:pPr>
+        <w:pStyle w:val="Heading3"/>
+        <w:spacing w:beforeAutospacing="1" w:afterAutospacing="1"/>
+        <w:rPr>
+          <w:b/>
+          <w:bCs/>
+          <w:color w:val="000000"/>
+        </w:rPr>
+      </w:pPr>
+      <w:r>
+        <w:rPr>
+          <w:rFonts w:eastAsia="Times New Roman" w:cs="Times New Roman" w:ascii="Times New Roman" w:hAnsi="Times New Roman"/>
+          <w:b/>
+          <w:bCs/>
+          <w:color w:val="000000"/>
+          <w:sz w:val="24"/>
+          <w:szCs w:val="24"/>
+        </w:rPr>
+        <w:t>Test 15 — Clonarea unui fișier inexistent pe destinație</w:t>
+      </w:r>
+    </w:p>
+    <w:p>
+      <w:pPr>
+        <w:pStyle w:val="BodyText"/>
+        <w:bidi w:val="0"/>
+        <w:ind w:hanging="0" w:left="0" w:right="0"/>
+        <w:rPr/>
+      </w:pPr>
+      <w:r>
+        <w:rPr>
+          <w:b/>
+          <w:bCs/>
+        </w:rPr>
+        <w:t>Scop:</w:t>
+      </w:r>
+      <w:r>
+        <w:rPr/>
+        <w:t xml:space="preserve"> Verificarea faptului că un fișier prezent în home-directory-ul unui utilizator de pe sursă este transferat pe destinație în urma clonării.</w:t>
+        <w:br/>
+      </w:r>
+      <w:r>
+        <w:rPr>
+          <w:b/>
+          <w:bCs/>
+        </w:rPr>
+        <w:t>Pași</w:t>
+      </w:r>
+      <w:r>
+        <w:rPr/>
+        <w:t>:</w:t>
+      </w:r>
+    </w:p>
+    <w:p>
+      <w:pPr>
+        <w:pStyle w:val="BodyText"/>
+        <w:numPr>
+          <w:ilvl w:val="0"/>
+          <w:numId w:val="13"/>
+        </w:numPr>
+        <w:tabs>
+          <w:tab w:val="clear" w:pos="708"/>
+          <w:tab w:val="left" w:pos="0" w:leader="none"/>
+        </w:tabs>
+        <w:bidi w:val="0"/>
+        <w:spacing w:before="0" w:after="0"/>
+        <w:ind w:hanging="283" w:left="709" w:right="0"/>
+        <w:rPr/>
+      </w:pPr>
+      <w:r>
+        <w:rPr/>
+        <w:t>Pe sistemul sursă, se creează un fișier de test în home-directory-ul lui user3 cu comanda:</w:t>
+        <w:br/>
+        <w:t xml:space="preserve">sudo -u user3 bash -c 'echo "print("cod de test")" &gt; /home/user3/test.py' </w:t>
+      </w:r>
+    </w:p>
+    <w:p>
+      <w:pPr>
+        <w:pStyle w:val="BodyText"/>
+        <w:numPr>
+          <w:ilvl w:val="0"/>
+          <w:numId w:val="13"/>
+        </w:numPr>
+        <w:tabs>
+          <w:tab w:val="clear" w:pos="708"/>
+          <w:tab w:val="left" w:pos="0" w:leader="none"/>
+        </w:tabs>
+        <w:bidi w:val="0"/>
+        <w:spacing w:before="0" w:after="0"/>
+        <w:ind w:hanging="283" w:left="709"/>
+        <w:rPr/>
+      </w:pPr>
+      <w:r>
+        <w:rPr/>
+        <w:t>Pe sistemul destinație, se verifică absența fișierului cu comanda:</w:t>
+        <w:br/>
+        <w:t xml:space="preserve">sudo ls /home/user3/test.py </w:t>
+      </w:r>
+    </w:p>
+    <w:p>
+      <w:pPr>
+        <w:pStyle w:val="BodyText"/>
+        <w:numPr>
+          <w:ilvl w:val="0"/>
+          <w:numId w:val="13"/>
+        </w:numPr>
+        <w:tabs>
+          <w:tab w:val="clear" w:pos="708"/>
+          <w:tab w:val="left" w:pos="0" w:leader="none"/>
+        </w:tabs>
+        <w:bidi w:val="0"/>
+        <w:spacing w:before="0" w:after="0"/>
+        <w:ind w:hanging="283" w:left="709"/>
+        <w:rPr/>
+      </w:pPr>
+      <w:r>
+        <w:rPr/>
+        <w:t>Pe sistemul sursă, se rulează clonarea și se confirmă cu d:</w:t>
+        <w:br/>
+        <w:t>cd ~/Desktop/git/Clonare-sistem-Linux</w:t>
+        <w:br/>
+        <w:t xml:space="preserve">./scripts/clonare.sh --mod sursa --tinta 192.168.56.102 --user vladescu </w:t>
+      </w:r>
+    </w:p>
+    <w:p>
+      <w:pPr>
+        <w:pStyle w:val="BodyText"/>
+        <w:numPr>
+          <w:ilvl w:val="0"/>
+          <w:numId w:val="13"/>
+        </w:numPr>
+        <w:tabs>
+          <w:tab w:val="clear" w:pos="708"/>
+          <w:tab w:val="left" w:pos="0" w:leader="none"/>
+        </w:tabs>
+        <w:bidi w:val="0"/>
+        <w:ind w:hanging="283" w:left="709"/>
+        <w:rPr/>
+      </w:pPr>
+      <w:r>
+        <w:rPr/>
+        <w:t>Pe sistemul destinație, se verifică conținutul fișierului transferat cu comanda:</w:t>
+        <w:br/>
+        <w:t xml:space="preserve">sudo cat /home/user3/test.py </w:t>
+      </w:r>
+    </w:p>
+    <w:p>
+      <w:pPr>
+        <w:pStyle w:val="BodyText"/>
+        <w:bidi w:val="0"/>
+        <w:ind w:hanging="0" w:left="0" w:right="0"/>
+        <w:rPr/>
+      </w:pPr>
+      <w:r>
+        <w:rPr>
+          <w:b/>
+          <w:bCs/>
+        </w:rPr>
+        <w:t xml:space="preserve">Rezultat obținut: </w:t>
+      </w:r>
+      <w:r>
+        <w:rPr/>
+        <w:t xml:space="preserve">Înainte de clonare, fișierul nu există pe destinație („No such file or directory”). După clonare, fișierul </w:t>
       </w:r>
       <w:r>
         <w:rPr>
           <w:rStyle w:val="SourceText"/>
         </w:rPr>
-        <w:t>tree</w:t>
-      </w:r>
-      <w:r>
-        <w:rPr/>
-        <w:t xml:space="preserve"> ca lipsind pe destinație și îl instalează prin </w:t>
+        <w:t>/home/user3/test.py</w:t>
+      </w:r>
+      <w:r>
+        <w:rPr/>
+        <w:t xml:space="preserve"> există și conține exact textul creat pe sursă: </w:t>
       </w:r>
       <w:r>
         <w:rPr>
           <w:rStyle w:val="SourceText"/>
         </w:rPr>
-        <w:t>apt</w:t>
-      </w:r>
-      <w:r>
-        <w:rPr/>
-        <w:t xml:space="preserve">. După clonare, </w:t>
-      </w:r>
-      <w:r>
-        <w:rPr>
-          <w:rStyle w:val="SourceText"/>
-        </w:rPr>
-        <w:t>which tree</w:t>
-      </w:r>
-      <w:r>
-        <w:rPr/>
-        <w:t xml:space="preserve"> returnează calea </w:t>
-      </w:r>
-      <w:r>
-        <w:rPr>
-          <w:rStyle w:val="SourceText"/>
-        </w:rPr>
-        <w:t>/usr/bin/tree</w:t>
-      </w:r>
-      <w:r>
-        <w:rPr/>
-        <w:t>, confirmând instalarea.</w:t>
+        <w:t>print("cod de test")</w:t>
+      </w:r>
+      <w:r>
+        <w:rPr/>
+        <w:t>.</w:t>
       </w:r>
     </w:p>
     <w:p>
@@ -5600,6 +5867,125 @@
     </w:lvl>
   </w:abstractNum>
   <w:abstractNum w:abstractNumId="13">
+    <w:lvl w:ilvl="0">
+      <w:start w:val="1"/>
+      <w:numFmt w:val="decimal"/>
+      <w:lvlText w:val="%1."/>
+      <w:lvlJc w:val="left"/>
+      <w:pPr>
+        <w:tabs>
+          <w:tab w:val="num" w:pos="709"/>
+        </w:tabs>
+        <w:ind w:left="709" w:hanging="283"/>
+      </w:pPr>
+      <w:rPr/>
+    </w:lvl>
+    <w:lvl w:ilvl="1">
+      <w:start w:val="1"/>
+      <w:numFmt w:val="decimal"/>
+      <w:lvlText w:val="%2."/>
+      <w:lvlJc w:val="left"/>
+      <w:pPr>
+        <w:tabs>
+          <w:tab w:val="num" w:pos="1418"/>
+        </w:tabs>
+        <w:ind w:left="1418" w:hanging="283"/>
+      </w:pPr>
+      <w:rPr/>
+    </w:lvl>
+    <w:lvl w:ilvl="2">
+      <w:start w:val="1"/>
+      <w:numFmt w:val="decimal"/>
+      <w:lvlText w:val="%3."/>
+      <w:lvlJc w:val="left"/>
+      <w:pPr>
+        <w:tabs>
+          <w:tab w:val="num" w:pos="2127"/>
+        </w:tabs>
+        <w:ind w:left="2127" w:hanging="283"/>
+      </w:pPr>
+      <w:rPr/>
+    </w:lvl>
+    <w:lvl w:ilvl="3">
+      <w:start w:val="1"/>
+      <w:numFmt w:val="decimal"/>
+      <w:lvlText w:val="%4."/>
+      <w:lvlJc w:val="left"/>
+      <w:pPr>
+        <w:tabs>
+          <w:tab w:val="num" w:pos="2836"/>
+        </w:tabs>
+        <w:ind w:left="2836" w:hanging="283"/>
+      </w:pPr>
+      <w:rPr/>
+    </w:lvl>
+    <w:lvl w:ilvl="4">
+      <w:start w:val="1"/>
+      <w:numFmt w:val="decimal"/>
+      <w:lvlText w:val="%5."/>
+      <w:lvlJc w:val="left"/>
+      <w:pPr>
+        <w:tabs>
+          <w:tab w:val="num" w:pos="3545"/>
+        </w:tabs>
+        <w:ind w:left="3545" w:hanging="283"/>
+      </w:pPr>
+      <w:rPr/>
+    </w:lvl>
+    <w:lvl w:ilvl="5">
+      <w:start w:val="1"/>
+      <w:numFmt w:val="decimal"/>
+      <w:lvlText w:val="%6."/>
+      <w:lvlJc w:val="left"/>
+      <w:pPr>
+        <w:tabs>
+          <w:tab w:val="num" w:pos="4254"/>
+        </w:tabs>
+        <w:ind w:left="4254" w:hanging="283"/>
+      </w:pPr>
+      <w:rPr/>
+    </w:lvl>
+    <w:lvl w:ilvl="6">
+      <w:start w:val="1"/>
+      <w:numFmt w:val="decimal"/>
+      <w:lvlText w:val="%7."/>
+      <w:lvlJc w:val="left"/>
+      <w:pPr>
+        <w:tabs>
+          <w:tab w:val="num" w:pos="4963"/>
+        </w:tabs>
+        <w:ind w:left="4963" w:hanging="283"/>
+      </w:pPr>
+      <w:rPr/>
+    </w:lvl>
+    <w:lvl w:ilvl="7">
+      <w:start w:val="1"/>
+      <w:numFmt w:val="decimal"/>
+      <w:lvlText w:val="%8."/>
+      <w:lvlJc w:val="left"/>
+      <w:pPr>
+        <w:tabs>
+          <w:tab w:val="num" w:pos="5672"/>
+        </w:tabs>
+        <w:ind w:left="5672" w:hanging="283"/>
+      </w:pPr>
+      <w:rPr/>
+    </w:lvl>
+    <w:lvl w:ilvl="8">
+      <w:start w:val="1"/>
+      <w:numFmt w:val="decimal"/>
+      <w:lvlText w:val="%9."/>
+      <w:lvlJc w:val="left"/>
+      <w:pPr>
+        <w:tabs>
+          <w:tab w:val="num" w:pos="6381"/>
+        </w:tabs>
+        <w:ind w:left="6381" w:hanging="283"/>
+      </w:pPr>
+      <w:rPr/>
+    </w:lvl>
+  </w:abstractNum>
+  <w:abstractNum w:abstractNumId="14">
     <w:lvl w:ilvl="0">
       <w:start w:val="1"/>
       <w:numFmt w:val="none"/>
@@ -5756,6 +6142,9 @@
   </w:num>
   <w:num w:numId="13">
     <w:abstractNumId w:val="13"/>
+  </w:num>
+  <w:num w:numId="14">
+    <w:abstractNumId w:val="14"/>
   </w:num>
 </w:numbering>
 </file>

</xml_diff>